<commit_message>
Added Python scripts for the ETL layer. Added a conversation_2026-04-06.txt as CoPilot log
</commit_message>
<xml_diff>
--- a/Docs/data_dictionary.docx
+++ b/Docs/data_dictionary.docx
@@ -3,11 +3,187 @@
 <w:document xmlns:wpc="http://schemas.microsoft.com/office/word/2010/wordprocessingCanvas" xmlns:mc="http://schemas.openxmlformats.org/markup-compatibility/2006" xmlns:o="urn:schemas-microsoft-com:office:office" xmlns:r="http://schemas.openxmlformats.org/officeDocument/2006/relationships" xmlns:m="http://schemas.openxmlformats.org/officeDocument/2006/math" xmlns:v="urn:schemas-microsoft-com:vml" xmlns:wp14="http://schemas.microsoft.com/office/word/2010/wordprocessingDrawing" xmlns:wp="http://schemas.openxmlformats.org/drawingml/2006/wordprocessingDrawing" xmlns:w10="urn:schemas-microsoft-com:office:word" xmlns:w="http://schemas.openxmlformats.org/wordprocessingml/2006/main" xmlns:w14="http://schemas.microsoft.com/office/word/2010/wordml" xmlns:w15="http://schemas.microsoft.com/office/word/2012/wordml" xmlns:wpg="http://schemas.microsoft.com/office/word/2010/wordprocessingGroup" xmlns:wpi="http://schemas.microsoft.com/office/word/2010/wordprocessingInk" xmlns:wne="http://schemas.microsoft.com/office/word/2006/wordml" xmlns:wps="http://schemas.microsoft.com/office/word/2010/wordprocessingShape" mc:Ignorable="w14 w15 wp14">
   <w:body>
     <w:p>
+      <w:pPr>
+        <w:pStyle w:val="Heading1"/>
+      </w:pPr>
+      <w:r>
+        <w:t>Data Architecture</w:t>
+      </w:r>
+    </w:p>
+    <w:p>
+      <w:pPr>
+        <w:pStyle w:val="Heading2"/>
+      </w:pPr>
+      <w:r>
+        <w:t>Data Generation</w:t>
+      </w:r>
+    </w:p>
+    <w:p>
+      <w:pPr>
+        <w:spacing w:after="0" w:line="240" w:lineRule="auto"/>
+      </w:pPr>
+    </w:p>
+    <w:p>
+      <w:pPr>
+        <w:spacing w:after="0" w:line="240" w:lineRule="auto"/>
+      </w:pPr>
+      <w:r>
+        <w:t>The `generate_data.py` script creates realistic HR datasets:</w:t>
+      </w:r>
+    </w:p>
+    <w:p>
+      <w:pPr>
+        <w:spacing w:after="0" w:line="240" w:lineRule="auto"/>
+      </w:pPr>
+    </w:p>
+    <w:p>
+      <w:pPr>
+        <w:spacing w:after="0" w:line="240" w:lineRule="auto"/>
+      </w:pPr>
+      <w:r>
+        <w:t xml:space="preserve">- </w:t>
+      </w:r>
+      <w:r>
+        <w:rPr>
+          <w:bCs/>
+        </w:rPr>
+        <w:t>200 employees</w:t>
+      </w:r>
+      <w:r>
+        <w:t xml:space="preserve"> across 6 departments</w:t>
+      </w:r>
+    </w:p>
+    <w:p>
+      <w:pPr>
+        <w:spacing w:after="0" w:line="240" w:lineRule="auto"/>
+      </w:pPr>
+      <w:r>
+        <w:t xml:space="preserve">- </w:t>
+      </w:r>
+      <w:r>
+        <w:rPr>
+          <w:bCs/>
+        </w:rPr>
+        <w:t>40 managers</w:t>
+      </w:r>
+      <w:r>
+        <w:t xml:space="preserve"> (~20% of workforce)</w:t>
+      </w:r>
+    </w:p>
+    <w:p>
+      <w:pPr>
+        <w:spacing w:after="0" w:line="240" w:lineRule="auto"/>
+      </w:pPr>
+      <w:r>
+        <w:t xml:space="preserve">- </w:t>
+      </w:r>
+      <w:r>
+        <w:rPr>
+          <w:bCs/>
+        </w:rPr>
+        <w:t>402 performance reviews</w:t>
+      </w:r>
+      <w:r>
+        <w:t xml:space="preserve"> (1-3 per employee)</w:t>
+      </w:r>
+    </w:p>
+    <w:p>
+      <w:pPr>
+        <w:spacing w:after="0" w:line="240" w:lineRule="auto"/>
+      </w:pPr>
+      <w:r>
+        <w:t xml:space="preserve">- </w:t>
+      </w:r>
+      <w:r>
+        <w:rPr>
+          <w:bCs/>
+        </w:rPr>
+        <w:t>415 training records</w:t>
+      </w:r>
+      <w:r>
+        <w:t xml:space="preserve"> with completion dates and scores</w:t>
+      </w:r>
+    </w:p>
+    <w:p>
+      <w:pPr>
+        <w:spacing w:after="0" w:line="240" w:lineRule="auto"/>
+      </w:pPr>
+      <w:r>
+        <w:t xml:space="preserve">- </w:t>
+      </w:r>
+      <w:r>
+        <w:rPr>
+          <w:bCs/>
+        </w:rPr>
+        <w:t>30 turnover events</w:t>
+      </w:r>
+      <w:r>
+        <w:t xml:space="preserve"> (~15% attrition rate)</w:t>
+      </w:r>
+    </w:p>
+    <w:p>
+      <w:pPr>
+        <w:spacing w:after="0" w:line="240" w:lineRule="auto"/>
+      </w:pPr>
+    </w:p>
+    <w:p>
+      <w:pPr>
+        <w:pStyle w:val="Heading2"/>
+      </w:pPr>
+      <w:r>
+        <w:t>Database Schema</w:t>
+      </w:r>
+    </w:p>
+    <w:p>
+      <w:pPr>
+        <w:spacing w:after="0" w:line="240" w:lineRule="auto"/>
+      </w:pPr>
+    </w:p>
+    <w:p>
+      <w:pPr>
+        <w:spacing w:after="0" w:line="240" w:lineRule="auto"/>
+      </w:pPr>
+      <w:r>
+        <w:t>- `employees` - Master employee records</w:t>
+      </w:r>
+    </w:p>
+    <w:p>
+      <w:pPr>
+        <w:spacing w:after="0" w:line="240" w:lineRule="auto"/>
+      </w:pPr>
+      <w:r>
+        <w:t>- `managers` - Manager-employee relationships</w:t>
+      </w:r>
+    </w:p>
+    <w:p>
+      <w:pPr>
+        <w:spacing w:after="0" w:line="240" w:lineRule="auto"/>
+      </w:pPr>
+      <w:r>
+        <w:t>- `performance_reviews` - Historical performance ratings</w:t>
+      </w:r>
+    </w:p>
+    <w:p>
+      <w:pPr>
+        <w:spacing w:after="0" w:line="240" w:lineRule="auto"/>
+      </w:pPr>
+      <w:r>
+        <w:t>- `training_records` - Training completion tracking</w:t>
+      </w:r>
+    </w:p>
+    <w:p>
+      <w:pPr>
+        <w:spacing w:after="0" w:line="240" w:lineRule="auto"/>
+      </w:pPr>
+      <w:r>
+        <w:t>- `turnover` - Employee separation records</w:t>
+      </w:r>
+    </w:p>
+    <w:p/>
+    <w:p>
       <w:r>
         <w:t xml:space="preserve">Dataset </w:t>
       </w:r>
-      <w:bookmarkStart w:id="0" w:name="_GoBack"/>
-      <w:bookmarkEnd w:id="0"/>
       <w:r>
         <w:t xml:space="preserve">with </w:t>
       </w:r>
@@ -41,6 +217,14 @@
       <w:tblPr>
         <w:tblW w:w="0" w:type="auto"/>
         <w:tblCellSpacing w:w="15" w:type="dxa"/>
+        <w:tblBorders>
+          <w:top w:val="single" w:sz="4" w:space="0" w:color="auto"/>
+          <w:left w:val="single" w:sz="4" w:space="0" w:color="auto"/>
+          <w:bottom w:val="single" w:sz="4" w:space="0" w:color="auto"/>
+          <w:right w:val="single" w:sz="4" w:space="0" w:color="auto"/>
+          <w:insideH w:val="single" w:sz="4" w:space="0" w:color="auto"/>
+          <w:insideV w:val="single" w:sz="4" w:space="0" w:color="auto"/>
+        </w:tblBorders>
         <w:tblCellMar>
           <w:top w:w="15" w:type="dxa"/>
           <w:left w:w="15" w:type="dxa"/>
@@ -50,9 +234,9 @@
         <w:tblLook w:val="04A0" w:firstRow="1" w:lastRow="0" w:firstColumn="1" w:lastColumn="0" w:noHBand="0" w:noVBand="1"/>
       </w:tblPr>
       <w:tblGrid>
-        <w:gridCol w:w="1867"/>
-        <w:gridCol w:w="933"/>
-        <w:gridCol w:w="1102"/>
+        <w:gridCol w:w="1887"/>
+        <w:gridCol w:w="953"/>
+        <w:gridCol w:w="1122"/>
       </w:tblGrid>
       <w:tr>
         <w:trPr>
@@ -137,11 +321,9 @@
             <w:hideMark/>
           </w:tcPr>
           <w:p>
-            <w:proofErr w:type="spellStart"/>
             <w:r>
               <w:t>employee_id</w:t>
             </w:r>
-            <w:proofErr w:type="spellEnd"/>
           </w:p>
         </w:tc>
         <w:tc>
@@ -180,11 +362,9 @@
             <w:hideMark/>
           </w:tcPr>
           <w:p>
-            <w:proofErr w:type="spellStart"/>
             <w:r>
               <w:t>first_name</w:t>
             </w:r>
-            <w:proofErr w:type="spellEnd"/>
           </w:p>
         </w:tc>
         <w:tc>
@@ -223,11 +403,9 @@
             <w:hideMark/>
           </w:tcPr>
           <w:p>
-            <w:proofErr w:type="spellStart"/>
             <w:r>
               <w:t>last_name</w:t>
             </w:r>
-            <w:proofErr w:type="spellEnd"/>
           </w:p>
         </w:tc>
         <w:tc>
@@ -307,11 +485,9 @@
             <w:hideMark/>
           </w:tcPr>
           <w:p>
-            <w:proofErr w:type="spellStart"/>
             <w:r>
               <w:t>date_of_birth</w:t>
             </w:r>
-            <w:proofErr w:type="spellEnd"/>
           </w:p>
         </w:tc>
         <w:tc>
@@ -350,11 +526,9 @@
             <w:hideMark/>
           </w:tcPr>
           <w:p>
-            <w:proofErr w:type="spellStart"/>
             <w:r>
               <w:t>hire_date</w:t>
             </w:r>
-            <w:proofErr w:type="spellEnd"/>
           </w:p>
         </w:tc>
         <w:tc>
@@ -475,11 +649,9 @@
             <w:hideMark/>
           </w:tcPr>
           <w:p>
-            <w:proofErr w:type="spellStart"/>
             <w:r>
               <w:t>job_level</w:t>
             </w:r>
-            <w:proofErr w:type="spellEnd"/>
           </w:p>
         </w:tc>
         <w:tc>
@@ -559,11 +731,10 @@
             <w:hideMark/>
           </w:tcPr>
           <w:p>
-            <w:proofErr w:type="spellStart"/>
-            <w:r>
+            <w:r>
+              <w:lastRenderedPageBreak/>
               <w:t>manager_id</w:t>
             </w:r>
-            <w:proofErr w:type="spellEnd"/>
           </w:p>
         </w:tc>
         <w:tc>
@@ -602,11 +773,9 @@
             <w:hideMark/>
           </w:tcPr>
           <w:p>
-            <w:proofErr w:type="spellStart"/>
             <w:r>
               <w:t>employment_status</w:t>
             </w:r>
-            <w:proofErr w:type="spellEnd"/>
           </w:p>
         </w:tc>
         <w:tc>
@@ -635,6 +804,14 @@
         </w:tc>
       </w:tr>
     </w:tbl>
+    <w:p>
+      <w:pPr>
+        <w:rPr>
+          <w:b/>
+          <w:bCs/>
+        </w:rPr>
+      </w:pPr>
+    </w:p>
     <w:p>
       <w:pPr>
         <w:rPr>
@@ -656,6 +833,7 @@
           <w:ilvl w:val="0"/>
           <w:numId w:val="2"/>
         </w:numPr>
+        <w:spacing w:after="0" w:line="240" w:lineRule="auto"/>
       </w:pPr>
       <w:r>
         <w:t xml:space="preserve">IT </w:t>
@@ -667,6 +845,7 @@
           <w:ilvl w:val="0"/>
           <w:numId w:val="2"/>
         </w:numPr>
+        <w:spacing w:after="0" w:line="240" w:lineRule="auto"/>
       </w:pPr>
       <w:r>
         <w:t xml:space="preserve">Finance </w:t>
@@ -678,6 +857,7 @@
           <w:ilvl w:val="0"/>
           <w:numId w:val="2"/>
         </w:numPr>
+        <w:spacing w:after="0" w:line="240" w:lineRule="auto"/>
       </w:pPr>
       <w:r>
         <w:t xml:space="preserve">HR </w:t>
@@ -689,6 +869,7 @@
           <w:ilvl w:val="0"/>
           <w:numId w:val="2"/>
         </w:numPr>
+        <w:spacing w:after="0" w:line="240" w:lineRule="auto"/>
       </w:pPr>
       <w:r>
         <w:t xml:space="preserve">Operations </w:t>
@@ -700,6 +881,7 @@
           <w:ilvl w:val="0"/>
           <w:numId w:val="2"/>
         </w:numPr>
+        <w:spacing w:after="0" w:line="240" w:lineRule="auto"/>
       </w:pPr>
       <w:r>
         <w:t xml:space="preserve">Sales </w:t>
@@ -711,10 +893,17 @@
           <w:ilvl w:val="0"/>
           <w:numId w:val="2"/>
         </w:numPr>
+        <w:spacing w:after="0" w:line="240" w:lineRule="auto"/>
       </w:pPr>
       <w:r>
         <w:t xml:space="preserve">Marketing </w:t>
       </w:r>
+    </w:p>
+    <w:p>
+      <w:pPr>
+        <w:spacing w:after="0" w:line="240" w:lineRule="auto"/>
+        <w:ind w:left="720"/>
+      </w:pPr>
     </w:p>
     <w:p>
       <w:pPr>
@@ -767,6 +956,14 @@
       <w:tblPr>
         <w:tblW w:w="0" w:type="auto"/>
         <w:tblCellSpacing w:w="15" w:type="dxa"/>
+        <w:tblBorders>
+          <w:top w:val="single" w:sz="4" w:space="0" w:color="auto"/>
+          <w:left w:val="single" w:sz="4" w:space="0" w:color="auto"/>
+          <w:bottom w:val="single" w:sz="4" w:space="0" w:color="auto"/>
+          <w:right w:val="single" w:sz="4" w:space="0" w:color="auto"/>
+          <w:insideH w:val="single" w:sz="4" w:space="0" w:color="auto"/>
+          <w:insideV w:val="single" w:sz="4" w:space="0" w:color="auto"/>
+        </w:tblBorders>
         <w:tblCellMar>
           <w:top w:w="15" w:type="dxa"/>
           <w:left w:w="15" w:type="dxa"/>
@@ -776,8 +973,8 @@
         <w:tblLook w:val="04A0" w:firstRow="1" w:lastRow="0" w:firstColumn="1" w:lastColumn="0" w:noHBand="0" w:noVBand="1"/>
       </w:tblPr>
       <w:tblGrid>
-        <w:gridCol w:w="1468"/>
-        <w:gridCol w:w="948"/>
+        <w:gridCol w:w="1488"/>
+        <w:gridCol w:w="968"/>
       </w:tblGrid>
       <w:tr>
         <w:trPr>
@@ -802,7 +999,6 @@
                 <w:b/>
                 <w:bCs/>
               </w:rPr>
-              <w:lastRenderedPageBreak/>
               <w:t>Field</w:t>
             </w:r>
           </w:p>
@@ -841,11 +1037,9 @@
             <w:hideMark/>
           </w:tcPr>
           <w:p>
-            <w:proofErr w:type="spellStart"/>
             <w:r>
               <w:t>turnover_id</w:t>
             </w:r>
-            <w:proofErr w:type="spellEnd"/>
           </w:p>
         </w:tc>
         <w:tc>
@@ -872,11 +1066,9 @@
             <w:hideMark/>
           </w:tcPr>
           <w:p>
-            <w:proofErr w:type="spellStart"/>
             <w:r>
               <w:t>employee_id</w:t>
             </w:r>
-            <w:proofErr w:type="spellEnd"/>
           </w:p>
         </w:tc>
         <w:tc>
@@ -903,11 +1095,9 @@
             <w:hideMark/>
           </w:tcPr>
           <w:p>
-            <w:proofErr w:type="spellStart"/>
             <w:r>
               <w:t>exit_date</w:t>
             </w:r>
-            <w:proofErr w:type="spellEnd"/>
           </w:p>
         </w:tc>
         <w:tc>
@@ -934,11 +1124,9 @@
             <w:hideMark/>
           </w:tcPr>
           <w:p>
-            <w:proofErr w:type="spellStart"/>
             <w:r>
               <w:t>turnover_type</w:t>
             </w:r>
-            <w:proofErr w:type="spellEnd"/>
           </w:p>
         </w:tc>
         <w:tc>
@@ -994,11 +1182,9 @@
             <w:hideMark/>
           </w:tcPr>
           <w:p>
-            <w:proofErr w:type="spellStart"/>
             <w:r>
               <w:t>tenure_months</w:t>
             </w:r>
-            <w:proofErr w:type="spellEnd"/>
           </w:p>
         </w:tc>
         <w:tc>
@@ -1017,6 +1203,16 @@
     </w:tbl>
     <w:p>
       <w:pPr>
+        <w:spacing w:after="0" w:line="240" w:lineRule="auto"/>
+        <w:rPr>
+          <w:b/>
+          <w:bCs/>
+        </w:rPr>
+      </w:pPr>
+    </w:p>
+    <w:p>
+      <w:pPr>
+        <w:spacing w:after="0" w:line="240" w:lineRule="auto"/>
         <w:rPr>
           <w:b/>
           <w:bCs/>
@@ -1036,6 +1232,7 @@
           <w:ilvl w:val="0"/>
           <w:numId w:val="3"/>
         </w:numPr>
+        <w:spacing w:after="0" w:line="240" w:lineRule="auto"/>
       </w:pPr>
       <w:r>
         <w:t xml:space="preserve">Voluntary </w:t>
@@ -1047,6 +1244,7 @@
           <w:ilvl w:val="0"/>
           <w:numId w:val="3"/>
         </w:numPr>
+        <w:spacing w:after="0" w:line="240" w:lineRule="auto"/>
       </w:pPr>
       <w:r>
         <w:t xml:space="preserve">Involuntary </w:t>
@@ -1054,6 +1252,16 @@
     </w:p>
     <w:p>
       <w:pPr>
+        <w:spacing w:after="0" w:line="240" w:lineRule="auto"/>
+        <w:rPr>
+          <w:b/>
+          <w:bCs/>
+        </w:rPr>
+      </w:pPr>
+    </w:p>
+    <w:p>
+      <w:pPr>
+        <w:spacing w:after="0" w:line="240" w:lineRule="auto"/>
         <w:rPr>
           <w:b/>
           <w:bCs/>
@@ -1073,6 +1281,7 @@
           <w:ilvl w:val="0"/>
           <w:numId w:val="4"/>
         </w:numPr>
+        <w:spacing w:after="0" w:line="240" w:lineRule="auto"/>
       </w:pPr>
       <w:r>
         <w:t xml:space="preserve">Better Opportunity </w:t>
@@ -1084,6 +1293,7 @@
           <w:ilvl w:val="0"/>
           <w:numId w:val="4"/>
         </w:numPr>
+        <w:spacing w:after="0" w:line="240" w:lineRule="auto"/>
       </w:pPr>
       <w:r>
         <w:t xml:space="preserve">Compensation </w:t>
@@ -1095,6 +1305,7 @@
           <w:ilvl w:val="0"/>
           <w:numId w:val="4"/>
         </w:numPr>
+        <w:spacing w:after="0" w:line="240" w:lineRule="auto"/>
       </w:pPr>
       <w:r>
         <w:t xml:space="preserve">Relocation </w:t>
@@ -1106,8 +1317,10 @@
           <w:ilvl w:val="0"/>
           <w:numId w:val="4"/>
         </w:numPr>
-      </w:pPr>
-      <w:r>
+        <w:spacing w:after="0" w:line="240" w:lineRule="auto"/>
+      </w:pPr>
+      <w:r>
+        <w:lastRenderedPageBreak/>
         <w:t xml:space="preserve">Retirement </w:t>
       </w:r>
     </w:p>
@@ -1117,6 +1330,7 @@
           <w:ilvl w:val="0"/>
           <w:numId w:val="4"/>
         </w:numPr>
+        <w:spacing w:after="0" w:line="240" w:lineRule="auto"/>
       </w:pPr>
       <w:r>
         <w:t xml:space="preserve">Performance </w:t>
@@ -1128,6 +1342,7 @@
           <w:ilvl w:val="0"/>
           <w:numId w:val="4"/>
         </w:numPr>
+        <w:spacing w:after="0" w:line="240" w:lineRule="auto"/>
       </w:pPr>
       <w:r>
         <w:t xml:space="preserve">Restructuring </w:t>
@@ -1135,6 +1350,13 @@
     </w:p>
     <w:p>
       <w:pPr>
+        <w:spacing w:after="0" w:line="240" w:lineRule="auto"/>
+        <w:ind w:left="720"/>
+      </w:pPr>
+    </w:p>
+    <w:p>
+      <w:pPr>
+        <w:spacing w:after="0" w:line="240" w:lineRule="auto"/>
         <w:rPr>
           <w:b/>
           <w:bCs/>
@@ -1149,11 +1371,17 @@
       </w:r>
     </w:p>
     <w:p>
+      <w:pPr>
+        <w:spacing w:after="0" w:line="240" w:lineRule="auto"/>
+      </w:pPr>
       <w:r>
         <w:t>100 records</w:t>
       </w:r>
     </w:p>
     <w:p>
+      <w:pPr>
+        <w:spacing w:after="0" w:line="240" w:lineRule="auto"/>
+      </w:pPr>
       <w:r>
         <w:t>(~20% turnover)</w:t>
       </w:r>
@@ -1184,6 +1412,14 @@
       <w:tblPr>
         <w:tblW w:w="0" w:type="auto"/>
         <w:tblCellSpacing w:w="15" w:type="dxa"/>
+        <w:tblBorders>
+          <w:top w:val="single" w:sz="4" w:space="0" w:color="auto"/>
+          <w:left w:val="single" w:sz="4" w:space="0" w:color="auto"/>
+          <w:bottom w:val="single" w:sz="4" w:space="0" w:color="auto"/>
+          <w:right w:val="single" w:sz="4" w:space="0" w:color="auto"/>
+          <w:insideH w:val="single" w:sz="4" w:space="0" w:color="auto"/>
+          <w:insideV w:val="single" w:sz="4" w:space="0" w:color="auto"/>
+        </w:tblBorders>
         <w:tblCellMar>
           <w:top w:w="15" w:type="dxa"/>
           <w:left w:w="15" w:type="dxa"/>
@@ -1193,8 +1429,8 @@
         <w:tblLook w:val="04A0" w:firstRow="1" w:lastRow="0" w:firstColumn="1" w:lastColumn="0" w:noHBand="0" w:noVBand="1"/>
       </w:tblPr>
       <w:tblGrid>
-        <w:gridCol w:w="1746"/>
-        <w:gridCol w:w="956"/>
+        <w:gridCol w:w="1766"/>
+        <w:gridCol w:w="976"/>
       </w:tblGrid>
       <w:tr>
         <w:trPr>
@@ -1257,11 +1493,9 @@
             <w:hideMark/>
           </w:tcPr>
           <w:p>
-            <w:proofErr w:type="spellStart"/>
             <w:r>
               <w:t>review_id</w:t>
             </w:r>
-            <w:proofErr w:type="spellEnd"/>
           </w:p>
         </w:tc>
         <w:tc>
@@ -1288,11 +1522,9 @@
             <w:hideMark/>
           </w:tcPr>
           <w:p>
-            <w:proofErr w:type="spellStart"/>
             <w:r>
               <w:t>employee_id</w:t>
             </w:r>
-            <w:proofErr w:type="spellEnd"/>
           </w:p>
         </w:tc>
         <w:tc>
@@ -1319,11 +1551,9 @@
             <w:hideMark/>
           </w:tcPr>
           <w:p>
-            <w:proofErr w:type="spellStart"/>
             <w:r>
               <w:t>review_period</w:t>
             </w:r>
-            <w:proofErr w:type="spellEnd"/>
           </w:p>
         </w:tc>
         <w:tc>
@@ -1350,11 +1580,9 @@
             <w:hideMark/>
           </w:tcPr>
           <w:p>
-            <w:proofErr w:type="spellStart"/>
             <w:r>
               <w:t>manager_rating</w:t>
             </w:r>
-            <w:proofErr w:type="spellEnd"/>
           </w:p>
         </w:tc>
         <w:tc>
@@ -1381,12 +1609,9 @@
             <w:hideMark/>
           </w:tcPr>
           <w:p>
-            <w:proofErr w:type="spellStart"/>
-            <w:r>
-              <w:lastRenderedPageBreak/>
+            <w:r>
               <w:t>productivity_score</w:t>
             </w:r>
-            <w:proofErr w:type="spellEnd"/>
           </w:p>
         </w:tc>
         <w:tc>
@@ -1413,11 +1638,9 @@
             <w:hideMark/>
           </w:tcPr>
           <w:p>
-            <w:proofErr w:type="spellStart"/>
             <w:r>
               <w:t>teamwork_score</w:t>
             </w:r>
-            <w:proofErr w:type="spellEnd"/>
           </w:p>
         </w:tc>
         <w:tc>
@@ -1444,11 +1667,9 @@
             <w:hideMark/>
           </w:tcPr>
           <w:p>
-            <w:proofErr w:type="spellStart"/>
             <w:r>
               <w:t>promotion_ready</w:t>
             </w:r>
-            <w:proofErr w:type="spellEnd"/>
           </w:p>
         </w:tc>
         <w:tc>
@@ -1467,25 +1688,46 @@
     </w:tbl>
     <w:p>
       <w:pPr>
+        <w:spacing w:after="0" w:line="240" w:lineRule="auto"/>
         <w:rPr>
           <w:b/>
           <w:bCs/>
         </w:rPr>
       </w:pPr>
-      <w:r>
+    </w:p>
+    <w:p>
+      <w:pPr>
+        <w:spacing w:after="0" w:line="240" w:lineRule="auto"/>
         <w:rPr>
           <w:b/>
           <w:bCs/>
         </w:rPr>
+      </w:pPr>
+      <w:r>
+        <w:rPr>
+          <w:b/>
+          <w:bCs/>
+        </w:rPr>
         <w:t>Ratings</w:t>
       </w:r>
     </w:p>
     <w:p>
+      <w:pPr>
+        <w:spacing w:after="0" w:line="240" w:lineRule="auto"/>
+      </w:pPr>
       <w:r>
         <w:t>1.0–5.0</w:t>
       </w:r>
     </w:p>
     <w:p>
+      <w:pPr>
+        <w:spacing w:after="0" w:line="240" w:lineRule="auto"/>
+      </w:pPr>
+    </w:p>
+    <w:p>
+      <w:pPr>
+        <w:spacing w:after="0" w:line="240" w:lineRule="auto"/>
+      </w:pPr>
       <w:r>
         <w:t>Example:</w:t>
       </w:r>
@@ -1494,6 +1736,14 @@
       <w:tblPr>
         <w:tblW w:w="0" w:type="auto"/>
         <w:tblCellSpacing w:w="15" w:type="dxa"/>
+        <w:tblBorders>
+          <w:top w:val="single" w:sz="4" w:space="0" w:color="auto"/>
+          <w:left w:val="single" w:sz="4" w:space="0" w:color="auto"/>
+          <w:bottom w:val="single" w:sz="4" w:space="0" w:color="auto"/>
+          <w:right w:val="single" w:sz="4" w:space="0" w:color="auto"/>
+          <w:insideH w:val="single" w:sz="4" w:space="0" w:color="auto"/>
+          <w:insideV w:val="single" w:sz="4" w:space="0" w:color="auto"/>
+        </w:tblBorders>
         <w:tblCellMar>
           <w:top w:w="15" w:type="dxa"/>
           <w:left w:w="15" w:type="dxa"/>
@@ -1503,8 +1753,8 @@
         <w:tblLook w:val="04A0" w:firstRow="1" w:lastRow="0" w:firstColumn="1" w:lastColumn="0" w:noHBand="0" w:noVBand="1"/>
       </w:tblPr>
       <w:tblGrid>
-        <w:gridCol w:w="1263"/>
-        <w:gridCol w:w="615"/>
+        <w:gridCol w:w="1283"/>
+        <w:gridCol w:w="635"/>
       </w:tblGrid>
       <w:tr>
         <w:trPr>
@@ -1524,7 +1774,6 @@
                 <w:bCs/>
               </w:rPr>
             </w:pPr>
-            <w:proofErr w:type="spellStart"/>
             <w:r>
               <w:rPr>
                 <w:b/>
@@ -1532,7 +1781,6 @@
               </w:rPr>
               <w:t>employee_id</w:t>
             </w:r>
-            <w:proofErr w:type="spellEnd"/>
           </w:p>
         </w:tc>
         <w:tc>
@@ -1619,25 +1867,41 @@
     </w:tbl>
     <w:p>
       <w:pPr>
+        <w:spacing w:after="0" w:line="240" w:lineRule="auto"/>
         <w:rPr>
           <w:b/>
           <w:bCs/>
         </w:rPr>
       </w:pPr>
-      <w:r>
+    </w:p>
+    <w:p>
+      <w:pPr>
+        <w:spacing w:after="0" w:line="240" w:lineRule="auto"/>
         <w:rPr>
           <w:b/>
           <w:bCs/>
         </w:rPr>
+      </w:pPr>
+      <w:r>
+        <w:rPr>
+          <w:b/>
+          <w:bCs/>
+        </w:rPr>
         <w:t>Suggested Volume</w:t>
       </w:r>
     </w:p>
     <w:p>
+      <w:pPr>
+        <w:spacing w:after="0" w:line="240" w:lineRule="auto"/>
+      </w:pPr>
       <w:r>
         <w:t>1,500 records</w:t>
       </w:r>
     </w:p>
     <w:p>
+      <w:pPr>
+        <w:spacing w:after="0" w:line="240" w:lineRule="auto"/>
+      </w:pPr>
       <w:r>
         <w:t>(3 reviews per employee)</w:t>
       </w:r>
@@ -1668,6 +1932,14 @@
       <w:tblPr>
         <w:tblW w:w="0" w:type="auto"/>
         <w:tblCellSpacing w:w="15" w:type="dxa"/>
+        <w:tblBorders>
+          <w:top w:val="single" w:sz="4" w:space="0" w:color="auto"/>
+          <w:left w:val="single" w:sz="4" w:space="0" w:color="auto"/>
+          <w:bottom w:val="single" w:sz="4" w:space="0" w:color="auto"/>
+          <w:right w:val="single" w:sz="4" w:space="0" w:color="auto"/>
+          <w:insideH w:val="single" w:sz="4" w:space="0" w:color="auto"/>
+          <w:insideV w:val="single" w:sz="4" w:space="0" w:color="auto"/>
+        </w:tblBorders>
         <w:tblCellMar>
           <w:top w:w="15" w:type="dxa"/>
           <w:left w:w="15" w:type="dxa"/>
@@ -1677,8 +1949,8 @@
         <w:tblLook w:val="04A0" w:firstRow="1" w:lastRow="0" w:firstColumn="1" w:lastColumn="0" w:noHBand="0" w:noVBand="1"/>
       </w:tblPr>
       <w:tblGrid>
-        <w:gridCol w:w="1742"/>
-        <w:gridCol w:w="948"/>
+        <w:gridCol w:w="1762"/>
+        <w:gridCol w:w="968"/>
       </w:tblGrid>
       <w:tr>
         <w:trPr>
@@ -1703,6 +1975,7 @@
                 <w:b/>
                 <w:bCs/>
               </w:rPr>
+              <w:lastRenderedPageBreak/>
               <w:t>Field</w:t>
             </w:r>
           </w:p>
@@ -1741,11 +2014,9 @@
             <w:hideMark/>
           </w:tcPr>
           <w:p>
-            <w:proofErr w:type="spellStart"/>
             <w:r>
               <w:t>training_id</w:t>
             </w:r>
-            <w:proofErr w:type="spellEnd"/>
           </w:p>
         </w:tc>
         <w:tc>
@@ -1772,11 +2043,9 @@
             <w:hideMark/>
           </w:tcPr>
           <w:p>
-            <w:proofErr w:type="spellStart"/>
             <w:r>
               <w:t>employee_id</w:t>
             </w:r>
-            <w:proofErr w:type="spellEnd"/>
           </w:p>
         </w:tc>
         <w:tc>
@@ -1803,11 +2072,9 @@
             <w:hideMark/>
           </w:tcPr>
           <w:p>
-            <w:proofErr w:type="spellStart"/>
             <w:r>
               <w:t>course_name</w:t>
             </w:r>
-            <w:proofErr w:type="spellEnd"/>
           </w:p>
         </w:tc>
         <w:tc>
@@ -1834,11 +2101,9 @@
             <w:hideMark/>
           </w:tcPr>
           <w:p>
-            <w:proofErr w:type="spellStart"/>
             <w:r>
               <w:t>assigned_date</w:t>
             </w:r>
-            <w:proofErr w:type="spellEnd"/>
           </w:p>
         </w:tc>
         <w:tc>
@@ -1865,11 +2130,9 @@
             <w:hideMark/>
           </w:tcPr>
           <w:p>
-            <w:proofErr w:type="spellStart"/>
             <w:r>
               <w:t>completion_date</w:t>
             </w:r>
-            <w:proofErr w:type="spellEnd"/>
           </w:p>
         </w:tc>
         <w:tc>
@@ -1896,11 +2159,9 @@
             <w:hideMark/>
           </w:tcPr>
           <w:p>
-            <w:proofErr w:type="spellStart"/>
             <w:r>
               <w:t>completion_status</w:t>
             </w:r>
-            <w:proofErr w:type="spellEnd"/>
           </w:p>
         </w:tc>
         <w:tc>
@@ -1948,6 +2209,16 @@
     </w:tbl>
     <w:p>
       <w:pPr>
+        <w:spacing w:after="0" w:line="240" w:lineRule="auto"/>
+        <w:rPr>
+          <w:b/>
+          <w:bCs/>
+        </w:rPr>
+      </w:pPr>
+    </w:p>
+    <w:p>
+      <w:pPr>
+        <w:spacing w:after="0" w:line="240" w:lineRule="auto"/>
         <w:rPr>
           <w:b/>
           <w:bCs/>
@@ -1967,6 +2238,7 @@
           <w:ilvl w:val="0"/>
           <w:numId w:val="5"/>
         </w:numPr>
+        <w:spacing w:after="0" w:line="240" w:lineRule="auto"/>
       </w:pPr>
       <w:r>
         <w:t xml:space="preserve">Cybersecurity Awareness </w:t>
@@ -1978,9 +2250,9 @@
           <w:ilvl w:val="0"/>
           <w:numId w:val="5"/>
         </w:numPr>
-      </w:pPr>
-      <w:r>
-        <w:lastRenderedPageBreak/>
+        <w:spacing w:after="0" w:line="240" w:lineRule="auto"/>
+      </w:pPr>
+      <w:r>
         <w:t xml:space="preserve">Data Privacy </w:t>
       </w:r>
     </w:p>
@@ -1990,6 +2262,7 @@
           <w:ilvl w:val="0"/>
           <w:numId w:val="5"/>
         </w:numPr>
+        <w:spacing w:after="0" w:line="240" w:lineRule="auto"/>
       </w:pPr>
       <w:r>
         <w:t xml:space="preserve">Leadership Essentials </w:t>
@@ -2001,6 +2274,7 @@
           <w:ilvl w:val="0"/>
           <w:numId w:val="5"/>
         </w:numPr>
+        <w:spacing w:after="0" w:line="240" w:lineRule="auto"/>
       </w:pPr>
       <w:r>
         <w:t xml:space="preserve">Agile Fundamentals </w:t>
@@ -2012,6 +2286,7 @@
           <w:ilvl w:val="0"/>
           <w:numId w:val="5"/>
         </w:numPr>
+        <w:spacing w:after="0" w:line="240" w:lineRule="auto"/>
       </w:pPr>
       <w:r>
         <w:t xml:space="preserve">Communication Skills </w:t>
@@ -2023,6 +2298,7 @@
           <w:ilvl w:val="0"/>
           <w:numId w:val="5"/>
         </w:numPr>
+        <w:spacing w:after="0"/>
       </w:pPr>
       <w:r>
         <w:t xml:space="preserve">Diversity &amp; Inclusion </w:t>
@@ -2030,6 +2306,7 @@
     </w:p>
     <w:p>
       <w:pPr>
+        <w:spacing w:after="0" w:line="240" w:lineRule="auto"/>
         <w:rPr>
           <w:b/>
           <w:bCs/>
@@ -2049,6 +2326,7 @@
           <w:ilvl w:val="0"/>
           <w:numId w:val="6"/>
         </w:numPr>
+        <w:spacing w:after="0" w:line="240" w:lineRule="auto"/>
       </w:pPr>
       <w:r>
         <w:t xml:space="preserve">Completed </w:t>
@@ -2060,6 +2338,7 @@
           <w:ilvl w:val="0"/>
           <w:numId w:val="6"/>
         </w:numPr>
+        <w:spacing w:after="0" w:line="240" w:lineRule="auto"/>
       </w:pPr>
       <w:r>
         <w:t xml:space="preserve">In Progress </w:t>
@@ -2071,6 +2350,7 @@
           <w:ilvl w:val="0"/>
           <w:numId w:val="6"/>
         </w:numPr>
+        <w:spacing w:after="0" w:line="240" w:lineRule="auto"/>
       </w:pPr>
       <w:r>
         <w:t xml:space="preserve">Not Started </w:t>
@@ -2078,20 +2358,33 @@
     </w:p>
     <w:p>
       <w:pPr>
+        <w:spacing w:after="0" w:line="240" w:lineRule="auto"/>
         <w:rPr>
           <w:b/>
           <w:bCs/>
         </w:rPr>
       </w:pPr>
-      <w:r>
+    </w:p>
+    <w:p>
+      <w:pPr>
+        <w:spacing w:after="0" w:line="240" w:lineRule="auto"/>
         <w:rPr>
           <w:b/>
           <w:bCs/>
         </w:rPr>
+      </w:pPr>
+      <w:r>
+        <w:rPr>
+          <w:b/>
+          <w:bCs/>
+        </w:rPr>
         <w:t>Suggested Volume</w:t>
       </w:r>
     </w:p>
     <w:p>
+      <w:pPr>
+        <w:spacing w:after="0" w:line="240" w:lineRule="auto"/>
+      </w:pPr>
       <w:r>
         <w:t>2,500 records</w:t>
       </w:r>
@@ -2122,6 +2415,14 @@
       <w:tblPr>
         <w:tblW w:w="0" w:type="auto"/>
         <w:tblCellSpacing w:w="15" w:type="dxa"/>
+        <w:tblBorders>
+          <w:top w:val="single" w:sz="4" w:space="0" w:color="auto"/>
+          <w:left w:val="single" w:sz="4" w:space="0" w:color="auto"/>
+          <w:bottom w:val="single" w:sz="4" w:space="0" w:color="auto"/>
+          <w:right w:val="single" w:sz="4" w:space="0" w:color="auto"/>
+          <w:insideH w:val="single" w:sz="4" w:space="0" w:color="auto"/>
+          <w:insideV w:val="single" w:sz="4" w:space="0" w:color="auto"/>
+        </w:tblBorders>
         <w:tblCellMar>
           <w:top w:w="15" w:type="dxa"/>
           <w:left w:w="15" w:type="dxa"/>
@@ -2131,8 +2432,8 @@
         <w:tblLook w:val="04A0" w:firstRow="1" w:lastRow="0" w:firstColumn="1" w:lastColumn="0" w:noHBand="0" w:noVBand="1"/>
       </w:tblPr>
       <w:tblGrid>
-        <w:gridCol w:w="1647"/>
-        <w:gridCol w:w="948"/>
+        <w:gridCol w:w="1667"/>
+        <w:gridCol w:w="968"/>
       </w:tblGrid>
       <w:tr>
         <w:trPr>
@@ -2195,11 +2496,9 @@
             <w:hideMark/>
           </w:tcPr>
           <w:p>
-            <w:proofErr w:type="spellStart"/>
             <w:r>
               <w:t>manager_id</w:t>
             </w:r>
-            <w:proofErr w:type="spellEnd"/>
           </w:p>
         </w:tc>
         <w:tc>
@@ -2226,11 +2525,9 @@
             <w:hideMark/>
           </w:tcPr>
           <w:p>
-            <w:proofErr w:type="spellStart"/>
             <w:r>
               <w:t>manager_name</w:t>
             </w:r>
-            <w:proofErr w:type="spellEnd"/>
           </w:p>
         </w:tc>
         <w:tc>
@@ -2286,11 +2583,9 @@
             <w:hideMark/>
           </w:tcPr>
           <w:p>
-            <w:proofErr w:type="spellStart"/>
             <w:r>
               <w:t>years_experience</w:t>
             </w:r>
-            <w:proofErr w:type="spellEnd"/>
           </w:p>
         </w:tc>
         <w:tc>
@@ -2309,25 +2604,39 @@
     </w:tbl>
     <w:p>
       <w:pPr>
+        <w:spacing w:after="0" w:line="240" w:lineRule="auto"/>
         <w:rPr>
           <w:b/>
           <w:bCs/>
         </w:rPr>
       </w:pPr>
-      <w:r>
+    </w:p>
+    <w:p>
+      <w:pPr>
+        <w:spacing w:after="0" w:line="240" w:lineRule="auto"/>
         <w:rPr>
           <w:b/>
           <w:bCs/>
         </w:rPr>
+      </w:pPr>
+      <w:r>
+        <w:rPr>
+          <w:b/>
+          <w:bCs/>
+        </w:rPr>
         <w:t>Suggested Volume</w:t>
       </w:r>
     </w:p>
     <w:p>
+      <w:pPr>
+        <w:spacing w:after="0" w:line="240" w:lineRule="auto"/>
+      </w:pPr>
       <w:r>
         <w:t>25 managers</w:t>
       </w:r>
-    </w:p>
-    <w:p/>
+      <w:bookmarkStart w:id="0" w:name="_GoBack"/>
+      <w:bookmarkEnd w:id="0"/>
+    </w:p>
     <w:sectPr>
       <w:pgSz w:w="12240" w:h="15840"/>
       <w:pgMar w:top="1440" w:right="1440" w:bottom="1440" w:left="1440" w:header="720" w:footer="720" w:gutter="0"/>
@@ -3649,6 +3958,49 @@
     <w:name w:val="Normal"/>
     <w:qFormat/>
   </w:style>
+  <w:style w:type="paragraph" w:styleId="Heading1">
+    <w:name w:val="heading 1"/>
+    <w:basedOn w:val="Normal"/>
+    <w:next w:val="Normal"/>
+    <w:link w:val="Heading1Char"/>
+    <w:uiPriority w:val="9"/>
+    <w:qFormat/>
+    <w:rsid w:val="007C3BA9"/>
+    <w:pPr>
+      <w:keepNext/>
+      <w:keepLines/>
+      <w:spacing w:before="240" w:after="0"/>
+      <w:outlineLvl w:val="0"/>
+    </w:pPr>
+    <w:rPr>
+      <w:rFonts w:asciiTheme="majorHAnsi" w:eastAsiaTheme="majorEastAsia" w:hAnsiTheme="majorHAnsi" w:cstheme="majorBidi"/>
+      <w:color w:val="2E74B5" w:themeColor="accent1" w:themeShade="BF"/>
+      <w:sz w:val="32"/>
+      <w:szCs w:val="32"/>
+    </w:rPr>
+  </w:style>
+  <w:style w:type="paragraph" w:styleId="Heading2">
+    <w:name w:val="heading 2"/>
+    <w:basedOn w:val="Normal"/>
+    <w:next w:val="Normal"/>
+    <w:link w:val="Heading2Char"/>
+    <w:uiPriority w:val="9"/>
+    <w:unhideWhenUsed/>
+    <w:qFormat/>
+    <w:rsid w:val="007C3BA9"/>
+    <w:pPr>
+      <w:keepNext/>
+      <w:keepLines/>
+      <w:spacing w:before="40" w:after="0"/>
+      <w:outlineLvl w:val="1"/>
+    </w:pPr>
+    <w:rPr>
+      <w:rFonts w:asciiTheme="majorHAnsi" w:eastAsiaTheme="majorEastAsia" w:hAnsiTheme="majorHAnsi" w:cstheme="majorBidi"/>
+      <w:color w:val="2E74B5" w:themeColor="accent1" w:themeShade="BF"/>
+      <w:sz w:val="26"/>
+      <w:szCs w:val="26"/>
+    </w:rPr>
+  </w:style>
   <w:style w:type="character" w:default="1" w:styleId="DefaultParagraphFont">
     <w:name w:val="Default Paragraph Font"/>
     <w:uiPriority w:val="1"/>
@@ -3674,6 +4026,32 @@
     <w:uiPriority w:val="99"/>
     <w:semiHidden/>
     <w:unhideWhenUsed/>
+  </w:style>
+  <w:style w:type="character" w:customStyle="1" w:styleId="Heading1Char">
+    <w:name w:val="Heading 1 Char"/>
+    <w:basedOn w:val="DefaultParagraphFont"/>
+    <w:link w:val="Heading1"/>
+    <w:uiPriority w:val="9"/>
+    <w:rsid w:val="007C3BA9"/>
+    <w:rPr>
+      <w:rFonts w:asciiTheme="majorHAnsi" w:eastAsiaTheme="majorEastAsia" w:hAnsiTheme="majorHAnsi" w:cstheme="majorBidi"/>
+      <w:color w:val="2E74B5" w:themeColor="accent1" w:themeShade="BF"/>
+      <w:sz w:val="32"/>
+      <w:szCs w:val="32"/>
+    </w:rPr>
+  </w:style>
+  <w:style w:type="character" w:customStyle="1" w:styleId="Heading2Char">
+    <w:name w:val="Heading 2 Char"/>
+    <w:basedOn w:val="DefaultParagraphFont"/>
+    <w:link w:val="Heading2"/>
+    <w:uiPriority w:val="9"/>
+    <w:rsid w:val="007C3BA9"/>
+    <w:rPr>
+      <w:rFonts w:asciiTheme="majorHAnsi" w:eastAsiaTheme="majorEastAsia" w:hAnsiTheme="majorHAnsi" w:cstheme="majorBidi"/>
+      <w:color w:val="2E74B5" w:themeColor="accent1" w:themeShade="BF"/>
+      <w:sz w:val="26"/>
+      <w:szCs w:val="26"/>
+    </w:rPr>
   </w:style>
 </w:styles>
 </file>

</xml_diff>